<commit_message>
Update video, doc and fix typo
IT2 1/3/1
</commit_message>
<xml_diff>
--- a/src/site/pdfs/it2_u1_s3_p2_practice_letter.docx
+++ b/src/site/pdfs/it2_u1_s3_p2_practice_letter.docx
@@ -4,452 +4,646 @@
   <w:body>
     <w:p>
       <w:pPr>
-        <w:jc w:val="right"/>
-        <w:rPr>
-          <w:iCs/>
-          <w:color w:val="000000" w:themeColor="text1"/>
-        </w:rPr>
-      </w:pPr>
-    </w:p>
-    <w:p>
-      <w:pPr>
-        <w:rPr>
-          <w:rFonts w:cstheme="minorHAnsi"/>
-          <w:iCs/>
-          <w:color w:val="000000" w:themeColor="text1"/>
-          <w:sz w:val="22"/>
-          <w:szCs w:val="22"/>
-        </w:rPr>
-      </w:pPr>
-    </w:p>
-    <w:p>
-      <w:pPr>
-        <w:rPr>
-          <w:rFonts w:ascii="Arial" w:hAnsi="Arial" w:cs="Arial"/>
-          <w:iCs/>
-          <w:color w:val="000000" w:themeColor="text1"/>
-        </w:rPr>
-      </w:pPr>
-      <w:r>
-        <w:rPr>
-          <w:rFonts w:ascii="Arial" w:hAnsi="Arial" w:cs="Arial"/>
-          <w:iCs/>
-          <w:color w:val="000000" w:themeColor="text1"/>
-        </w:rPr>
-        <w:t>B smith</w:t>
-      </w:r>
-    </w:p>
-    <w:p>
-      <w:pPr>
-        <w:rPr>
-          <w:rFonts w:ascii="Arial" w:hAnsi="Arial" w:cs="Arial"/>
-          <w:iCs/>
-          <w:color w:val="000000" w:themeColor="text1"/>
-        </w:rPr>
-      </w:pPr>
-      <w:r>
-        <w:rPr>
-          <w:rFonts w:ascii="Arial" w:hAnsi="Arial" w:cs="Arial"/>
-          <w:iCs/>
-          <w:color w:val="000000" w:themeColor="text1"/>
-        </w:rPr>
-        <w:t>123 Business Rd</w:t>
-      </w:r>
-    </w:p>
-    <w:p>
-      <w:pPr>
-        <w:rPr>
-          <w:rFonts w:ascii="Arial" w:hAnsi="Arial" w:cs="Arial"/>
-          <w:iCs/>
-          <w:color w:val="000000" w:themeColor="text1"/>
-        </w:rPr>
-      </w:pPr>
-      <w:r>
-        <w:rPr>
-          <w:rFonts w:ascii="Arial" w:hAnsi="Arial" w:cs="Arial"/>
-          <w:iCs/>
-          <w:color w:val="000000" w:themeColor="text1"/>
-        </w:rPr>
-        <w:t xml:space="preserve"> Business City, </w:t>
-      </w:r>
-    </w:p>
-    <w:p>
-      <w:pPr>
-        <w:rPr>
-          <w:rFonts w:ascii="Arial" w:hAnsi="Arial" w:cs="Arial"/>
-          <w:iCs/>
-          <w:color w:val="000000" w:themeColor="text1"/>
-        </w:rPr>
-      </w:pPr>
-      <w:r>
-        <w:rPr>
-          <w:rFonts w:ascii="Arial" w:hAnsi="Arial" w:cs="Arial"/>
-          <w:iCs/>
-          <w:color w:val="000000" w:themeColor="text1"/>
-        </w:rPr>
-        <w:t>NR 1 1AA</w:t>
-      </w:r>
-    </w:p>
-    <w:p>
-      <w:pPr>
-        <w:rPr>
-          <w:rFonts w:ascii="Arial" w:hAnsi="Arial" w:cs="Arial"/>
-          <w:iCs/>
-          <w:color w:val="000000" w:themeColor="text1"/>
-        </w:rPr>
-      </w:pPr>
-      <w:r>
-        <w:rPr>
-          <w:rFonts w:ascii="Arial" w:hAnsi="Arial" w:cs="Arial"/>
-          <w:iCs/>
-          <w:color w:val="000000" w:themeColor="text1"/>
-        </w:rPr>
-        <w:t>bsmith@email.com</w:t>
-      </w:r>
-    </w:p>
-    <w:p>
-      <w:pPr>
-        <w:rPr>
-          <w:rFonts w:ascii="Arial" w:hAnsi="Arial" w:cs="Arial"/>
-          <w:iCs/>
-          <w:color w:val="000000" w:themeColor="text1"/>
-        </w:rPr>
-      </w:pPr>
-    </w:p>
-    <w:p>
-      <w:pPr>
-        <w:rPr>
-          <w:rFonts w:ascii="Arial" w:hAnsi="Arial" w:cs="Arial"/>
-          <w:iCs/>
-          <w:color w:val="000000" w:themeColor="text1"/>
-        </w:rPr>
-      </w:pPr>
-      <w:r>
-        <w:rPr>
-          <w:rFonts w:ascii="Arial" w:hAnsi="Arial" w:cs="Arial"/>
-          <w:iCs/>
-          <w:color w:val="000000" w:themeColor="text1"/>
-        </w:rPr>
-        <w:t>To all staff</w:t>
-      </w:r>
-    </w:p>
-    <w:p>
-      <w:pPr>
-        <w:rPr>
-          <w:rFonts w:ascii="Arial" w:hAnsi="Arial" w:cs="Arial"/>
-          <w:iCs/>
-          <w:color w:val="000000" w:themeColor="text1"/>
-        </w:rPr>
-      </w:pPr>
-    </w:p>
-    <w:p>
-      <w:pPr>
-        <w:rPr>
-          <w:rFonts w:ascii="Arial" w:hAnsi="Arial" w:cs="Arial"/>
-          <w:iCs/>
-          <w:color w:val="000000" w:themeColor="text1"/>
-        </w:rPr>
-      </w:pPr>
-      <w:r>
-        <w:rPr>
-          <w:rFonts w:ascii="Arial" w:hAnsi="Arial" w:cs="Arial"/>
-          <w:iCs/>
-          <w:color w:val="000000" w:themeColor="text1"/>
-        </w:rPr>
-        <w:t xml:space="preserve">I just wanted to say thank you for all the hard work that you have done over the last 6 months which has ensured that we have been able to meet our sales targets. </w:t>
-      </w:r>
-      <w:r>
-        <w:rPr>
-          <w:rFonts w:ascii="Arial" w:hAnsi="Arial" w:cs="Arial"/>
-          <w:iCs/>
-          <w:color w:val="000000" w:themeColor="text1"/>
-        </w:rPr>
-        <w:t xml:space="preserve">As a reward I have organized a weekend trip to one of our partner hotels which includes the </w:t>
-      </w:r>
-      <w:r>
-        <w:rPr>
-          <w:rFonts w:ascii="Arial" w:hAnsi="Arial" w:cs="Arial"/>
-          <w:iCs/>
-          <w:color w:val="000000" w:themeColor="text1"/>
-        </w:rPr>
-        <w:t>following:</w:t>
-      </w:r>
-    </w:p>
-    <w:p>
-      <w:pPr>
-        <w:rPr>
-          <w:rFonts w:ascii="Arial" w:hAnsi="Arial" w:cs="Arial"/>
-          <w:iCs/>
-          <w:color w:val="000000" w:themeColor="text1"/>
-        </w:rPr>
-      </w:pPr>
-    </w:p>
-    <w:p>
-      <w:pPr>
-        <w:rPr>
-          <w:rFonts w:ascii="Arial" w:hAnsi="Arial" w:cs="Arial"/>
-          <w:iCs/>
-          <w:color w:val="000000" w:themeColor="text1"/>
-        </w:rPr>
-      </w:pPr>
-      <w:r>
-        <w:rPr>
-          <w:rFonts w:ascii="Arial" w:hAnsi="Arial" w:cs="Arial"/>
-          <w:iCs/>
-          <w:color w:val="000000" w:themeColor="text1"/>
-        </w:rPr>
-        <w:t>Coach travel to and from the head office.</w:t>
-      </w:r>
-    </w:p>
-    <w:p>
-      <w:pPr>
-        <w:rPr>
-          <w:rFonts w:ascii="Arial" w:hAnsi="Arial" w:cs="Arial"/>
-          <w:iCs/>
-          <w:color w:val="000000" w:themeColor="text1"/>
-        </w:rPr>
-      </w:pPr>
-      <w:r>
-        <w:rPr>
-          <w:rFonts w:ascii="Arial" w:hAnsi="Arial" w:cs="Arial"/>
-          <w:iCs/>
-          <w:color w:val="000000" w:themeColor="text1"/>
-        </w:rPr>
-        <w:t xml:space="preserve"> A double room with ensuite for each member of staff</w:t>
-      </w:r>
-    </w:p>
-    <w:p>
-      <w:pPr>
-        <w:rPr>
-          <w:rFonts w:ascii="Arial" w:hAnsi="Arial" w:cs="Arial"/>
-          <w:iCs/>
-          <w:color w:val="000000" w:themeColor="text1"/>
-        </w:rPr>
-      </w:pPr>
-      <w:r>
-        <w:rPr>
-          <w:rFonts w:ascii="Arial" w:hAnsi="Arial" w:cs="Arial"/>
-          <w:iCs/>
-          <w:color w:val="000000" w:themeColor="text1"/>
-        </w:rPr>
-        <w:t>Breakfast, lunch and evening meals included</w:t>
-      </w:r>
-    </w:p>
-    <w:p>
-      <w:pPr>
-        <w:rPr>
-          <w:rFonts w:ascii="Arial" w:hAnsi="Arial" w:cs="Arial"/>
-          <w:iCs/>
-          <w:color w:val="000000" w:themeColor="text1"/>
-        </w:rPr>
-      </w:pPr>
-      <w:r>
-        <w:rPr>
-          <w:rFonts w:ascii="Arial" w:hAnsi="Arial" w:cs="Arial"/>
-          <w:iCs/>
-          <w:color w:val="000000" w:themeColor="text1"/>
-        </w:rPr>
-        <w:t>Full use of the Spa and pool</w:t>
-      </w:r>
-    </w:p>
-    <w:p>
-      <w:pPr>
-        <w:rPr>
-          <w:rFonts w:ascii="Arial" w:hAnsi="Arial" w:cs="Arial"/>
-          <w:iCs/>
-          <w:color w:val="000000" w:themeColor="text1"/>
-        </w:rPr>
-      </w:pPr>
-      <w:r>
-        <w:rPr>
-          <w:rFonts w:ascii="Arial" w:hAnsi="Arial" w:cs="Arial"/>
-          <w:iCs/>
-          <w:color w:val="000000" w:themeColor="text1"/>
-        </w:rPr>
-        <w:t>Access to the hotel golf course</w:t>
-      </w:r>
-    </w:p>
-    <w:p>
-      <w:pPr>
-        <w:rPr>
-          <w:rFonts w:ascii="Arial" w:hAnsi="Arial" w:cs="Arial"/>
-          <w:iCs/>
-          <w:color w:val="000000" w:themeColor="text1"/>
-        </w:rPr>
-      </w:pPr>
-    </w:p>
-    <w:p>
-      <w:pPr>
-        <w:rPr>
-          <w:rFonts w:ascii="Arial" w:hAnsi="Arial" w:cs="Arial"/>
-          <w:iCs/>
-          <w:color w:val="000000" w:themeColor="text1"/>
-        </w:rPr>
-      </w:pPr>
-      <w:r>
-        <w:rPr>
-          <w:rFonts w:ascii="Arial" w:hAnsi="Arial" w:cs="Arial"/>
-          <w:iCs/>
-          <w:color w:val="000000" w:themeColor="text1"/>
-        </w:rPr>
-        <w:t xml:space="preserve">If you could respond via email to confirm your availability, I will finalise the arrangements. If anyone has any special dietary requirements, please let me know. </w:t>
-      </w:r>
-    </w:p>
-    <w:p>
-      <w:pPr>
-        <w:rPr>
-          <w:rFonts w:ascii="Arial" w:hAnsi="Arial" w:cs="Arial"/>
-          <w:iCs/>
-          <w:color w:val="000000" w:themeColor="text1"/>
-        </w:rPr>
-      </w:pPr>
-    </w:p>
-    <w:p>
-      <w:pPr>
-        <w:rPr>
-          <w:rFonts w:ascii="Arial" w:hAnsi="Arial" w:cs="Arial"/>
-          <w:iCs/>
-          <w:color w:val="000000" w:themeColor="text1"/>
-        </w:rPr>
-      </w:pPr>
-    </w:p>
-    <w:p>
-      <w:pPr>
-        <w:rPr>
-          <w:rFonts w:ascii="Arial" w:hAnsi="Arial" w:cs="Arial"/>
-          <w:iCs/>
-          <w:color w:val="000000" w:themeColor="text1"/>
-        </w:rPr>
-      </w:pPr>
-    </w:p>
-    <w:p>
-      <w:pPr>
-        <w:rPr>
-          <w:rFonts w:ascii="Arial" w:hAnsi="Arial" w:cs="Arial"/>
-          <w:iCs/>
-          <w:color w:val="000000" w:themeColor="text1"/>
-        </w:rPr>
-      </w:pPr>
-    </w:p>
-    <w:p>
-      <w:pPr>
-        <w:rPr>
-          <w:rFonts w:ascii="Arial" w:hAnsi="Arial" w:cs="Arial"/>
-          <w:iCs/>
-          <w:color w:val="000000" w:themeColor="text1"/>
-        </w:rPr>
-      </w:pPr>
-    </w:p>
-    <w:p>
-      <w:pPr>
-        <w:rPr>
-          <w:rFonts w:ascii="Arial" w:hAnsi="Arial" w:cs="Arial"/>
-          <w:iCs/>
-          <w:color w:val="000000" w:themeColor="text1"/>
-        </w:rPr>
-      </w:pPr>
-      <w:r>
-        <w:rPr>
-          <w:rFonts w:ascii="Arial" w:hAnsi="Arial" w:cs="Arial"/>
-          <w:iCs/>
-          <w:color w:val="000000" w:themeColor="text1"/>
-        </w:rPr>
-        <w:t>Your sincerely</w:t>
-      </w:r>
-    </w:p>
-    <w:p>
-      <w:pPr>
-        <w:rPr>
-          <w:rFonts w:ascii="Arial" w:hAnsi="Arial" w:cs="Arial"/>
-          <w:iCs/>
-          <w:color w:val="000000" w:themeColor="text1"/>
-        </w:rPr>
-      </w:pPr>
-    </w:p>
-    <w:p>
-      <w:pPr>
-        <w:rPr>
-          <w:rFonts w:ascii="Arial" w:hAnsi="Arial" w:cs="Arial"/>
-          <w:iCs/>
-          <w:color w:val="000000" w:themeColor="text1"/>
-        </w:rPr>
-      </w:pPr>
-      <w:r>
-        <w:rPr>
-          <w:rFonts w:ascii="Arial" w:hAnsi="Arial" w:cs="Arial"/>
-          <w:iCs/>
-          <w:color w:val="000000" w:themeColor="text1"/>
-        </w:rPr>
-        <w:t>B. Smith</w:t>
-      </w:r>
-    </w:p>
-    <w:p>
-      <w:pPr>
-        <w:spacing w:line="360" w:lineRule="auto"/>
-        <w:rPr>
-          <w:rFonts w:ascii="Arial" w:hAnsi="Arial" w:cs="Arial"/>
-          <w:iCs/>
-          <w:color w:val="000000" w:themeColor="text1"/>
-        </w:rPr>
-      </w:pPr>
-    </w:p>
-    <w:p>
-      <w:pPr>
-        <w:spacing w:line="360" w:lineRule="auto"/>
-        <w:jc w:val="both"/>
-        <w:rPr>
-          <w:rFonts w:ascii="Arial" w:hAnsi="Arial" w:cs="Arial"/>
-          <w:iCs/>
-          <w:color w:val="000000" w:themeColor="text1"/>
-        </w:rPr>
-      </w:pPr>
-    </w:p>
-    <w:p>
-      <w:pPr>
-        <w:spacing w:line="360" w:lineRule="auto"/>
-        <w:jc w:val="both"/>
-        <w:rPr>
-          <w:rFonts w:ascii="Arial" w:hAnsi="Arial" w:cs="Arial"/>
-          <w:iCs/>
-          <w:color w:val="000000" w:themeColor="text1"/>
-        </w:rPr>
-      </w:pPr>
-    </w:p>
-    <w:p>
-      <w:pPr>
-        <w:spacing w:line="360" w:lineRule="auto"/>
-        <w:jc w:val="both"/>
-        <w:rPr>
-          <w:rFonts w:ascii="Arial" w:hAnsi="Arial" w:cs="Arial"/>
-          <w:iCs/>
-          <w:color w:val="000000" w:themeColor="text1"/>
-        </w:rPr>
-      </w:pPr>
-    </w:p>
-    <w:p>
-      <w:pPr>
-        <w:spacing w:line="360" w:lineRule="auto"/>
-        <w:jc w:val="both"/>
-        <w:rPr>
-          <w:rFonts w:ascii="Arial" w:hAnsi="Arial" w:cs="Arial"/>
-          <w:iCs/>
-          <w:color w:val="000000" w:themeColor="text1"/>
-        </w:rPr>
-      </w:pPr>
-    </w:p>
-    <w:p>
-      <w:pPr>
-        <w:spacing w:line="360" w:lineRule="auto"/>
-        <w:jc w:val="both"/>
-        <w:rPr>
-          <w:rFonts w:ascii="Arial" w:hAnsi="Arial" w:cs="Arial"/>
-          <w:iCs/>
-          <w:color w:val="000000" w:themeColor="text1"/>
-        </w:rPr>
-      </w:pPr>
-    </w:p>
-    <w:p/>
+        <w:rPr>
+          <w:rFonts w:ascii="Arial" w:hAnsi="Arial" w:cs="Arial"/>
+          <w:iCs/>
+          <w:color w:val="000000" w:themeColor="text1"/>
+        </w:rPr>
+      </w:pPr>
+    </w:p>
+    <w:p>
+      <w:pPr>
+        <w:rPr>
+          <w:rFonts w:ascii="Arial" w:hAnsi="Arial" w:cs="Arial"/>
+          <w:iCs/>
+          <w:color w:val="000000" w:themeColor="text1"/>
+        </w:rPr>
+      </w:pPr>
+      <w:r>
+        <w:rPr>
+          <w:rFonts w:ascii="Arial" w:hAnsi="Arial" w:cs="Arial"/>
+          <w:iCs/>
+          <w:color w:val="000000" w:themeColor="text1"/>
+        </w:rPr>
+        <w:t xml:space="preserve">Your </w:t>
+      </w:r>
+      <w:r>
+        <w:rPr>
+          <w:rFonts w:ascii="Arial" w:hAnsi="Arial" w:cs="Arial"/>
+          <w:iCs/>
+          <w:color w:val="000000" w:themeColor="text1"/>
+        </w:rPr>
+        <w:t>team</w:t>
+      </w:r>
+      <w:r>
+        <w:rPr>
+          <w:rFonts w:ascii="Arial" w:hAnsi="Arial" w:cs="Arial"/>
+          <w:iCs/>
+          <w:color w:val="000000" w:themeColor="text1"/>
+        </w:rPr>
+        <w:t xml:space="preserve"> was </w:t>
+      </w:r>
+      <w:r>
+        <w:rPr>
+          <w:rFonts w:ascii="Arial" w:hAnsi="Arial" w:cs="Arial"/>
+          <w:iCs/>
+          <w:color w:val="000000" w:themeColor="text1"/>
+        </w:rPr>
+        <w:t>great</w:t>
+      </w:r>
+      <w:r>
+        <w:rPr>
+          <w:rFonts w:ascii="Arial" w:hAnsi="Arial" w:cs="Arial"/>
+          <w:iCs/>
+          <w:color w:val="000000" w:themeColor="text1"/>
+        </w:rPr>
+        <w:t xml:space="preserve"> this quarter. You exceeded your own product development timeline by almost 30 days. </w:t>
+      </w:r>
+    </w:p>
+    <w:p>
+      <w:pPr>
+        <w:rPr>
+          <w:rFonts w:ascii="Arial" w:hAnsi="Arial" w:cs="Arial"/>
+          <w:iCs/>
+          <w:color w:val="000000" w:themeColor="text1"/>
+        </w:rPr>
+      </w:pPr>
+    </w:p>
+    <w:p>
+      <w:pPr>
+        <w:rPr>
+          <w:rFonts w:ascii="Arial" w:hAnsi="Arial" w:cs="Arial"/>
+          <w:iCs/>
+          <w:color w:val="000000" w:themeColor="text1"/>
+        </w:rPr>
+      </w:pPr>
+      <w:r>
+        <w:rPr>
+          <w:rFonts w:ascii="Arial" w:hAnsi="Arial" w:cs="Arial"/>
+          <w:iCs/>
+          <w:color w:val="000000" w:themeColor="text1"/>
+        </w:rPr>
+        <w:t>This allows us to release the product almost a month early which gives us great traction before the spring buying season begins</w:t>
+      </w:r>
+      <w:bookmarkStart w:id="0" w:name="_Hlk40785966"/>
+      <w:r>
+        <w:rPr>
+          <w:rFonts w:ascii="Arial" w:hAnsi="Arial" w:cs="Arial"/>
+          <w:iCs/>
+          <w:color w:val="000000" w:themeColor="text1"/>
+        </w:rPr>
+        <w:t xml:space="preserve">. </w:t>
+      </w:r>
+    </w:p>
+    <w:p>
+      <w:pPr>
+        <w:rPr>
+          <w:rFonts w:ascii="Arial" w:hAnsi="Arial" w:cs="Arial"/>
+          <w:iCs/>
+          <w:color w:val="000000" w:themeColor="text1"/>
+        </w:rPr>
+      </w:pPr>
+    </w:p>
+    <w:p>
+      <w:pPr>
+        <w:rPr>
+          <w:rFonts w:ascii="Arial" w:hAnsi="Arial" w:cs="Arial"/>
+          <w:iCs/>
+          <w:color w:val="000000" w:themeColor="text1"/>
+        </w:rPr>
+      </w:pPr>
+      <w:r>
+        <w:rPr>
+          <w:rFonts w:ascii="Arial" w:hAnsi="Arial" w:cs="Arial"/>
+          <w:iCs/>
+          <w:color w:val="000000" w:themeColor="text1"/>
+        </w:rPr>
+        <w:t>You would</w:t>
+      </w:r>
+      <w:r>
+        <w:rPr>
+          <w:rFonts w:ascii="Arial" w:hAnsi="Arial" w:cs="Arial"/>
+          <w:iCs/>
+          <w:color w:val="000000" w:themeColor="text1"/>
+        </w:rPr>
+        <w:t xml:space="preserve"> be the first to tell me that </w:t>
+      </w:r>
+      <w:r>
+        <w:rPr>
+          <w:rFonts w:ascii="Arial" w:hAnsi="Arial" w:cs="Arial"/>
+          <w:iCs/>
+          <w:color w:val="000000" w:themeColor="text1"/>
+        </w:rPr>
+        <w:t>it is</w:t>
+      </w:r>
+      <w:r>
+        <w:rPr>
+          <w:rFonts w:ascii="Arial" w:hAnsi="Arial" w:cs="Arial"/>
+          <w:iCs/>
+          <w:color w:val="000000" w:themeColor="text1"/>
+        </w:rPr>
+        <w:t xml:space="preserve"> the </w:t>
+      </w:r>
+      <w:r>
+        <w:rPr>
+          <w:rFonts w:ascii="Arial" w:hAnsi="Arial" w:cs="Arial"/>
+          <w:iCs/>
+          <w:color w:val="000000" w:themeColor="text1"/>
+        </w:rPr>
+        <w:t>team</w:t>
+      </w:r>
+      <w:r>
+        <w:rPr>
+          <w:rFonts w:ascii="Arial" w:hAnsi="Arial" w:cs="Arial"/>
+          <w:iCs/>
+          <w:color w:val="000000" w:themeColor="text1"/>
+        </w:rPr>
+        <w:t xml:space="preserve">'s efforts that will allow us to </w:t>
+      </w:r>
+      <w:r>
+        <w:rPr>
+          <w:rFonts w:ascii="Arial" w:hAnsi="Arial" w:cs="Arial"/>
+          <w:iCs/>
+          <w:color w:val="000000" w:themeColor="text1"/>
+        </w:rPr>
+        <w:t xml:space="preserve">achieve </w:t>
+      </w:r>
+      <w:r>
+        <w:rPr>
+          <w:rFonts w:ascii="Arial" w:hAnsi="Arial" w:cs="Arial"/>
+          <w:iCs/>
+          <w:color w:val="000000" w:themeColor="text1"/>
+        </w:rPr>
+        <w:t>early release</w:t>
+      </w:r>
+      <w:r>
+        <w:rPr>
+          <w:rFonts w:ascii="Arial" w:hAnsi="Arial" w:cs="Arial"/>
+          <w:iCs/>
+          <w:color w:val="000000" w:themeColor="text1"/>
+        </w:rPr>
+        <w:t>, b</w:t>
+      </w:r>
+      <w:r>
+        <w:rPr>
+          <w:rFonts w:ascii="Arial" w:hAnsi="Arial" w:cs="Arial"/>
+          <w:iCs/>
+          <w:color w:val="000000" w:themeColor="text1"/>
+        </w:rPr>
+        <w:t>ut</w:t>
+      </w:r>
+      <w:r>
+        <w:rPr>
+          <w:rFonts w:ascii="Arial" w:hAnsi="Arial" w:cs="Arial"/>
+          <w:iCs/>
+          <w:color w:val="000000" w:themeColor="text1"/>
+        </w:rPr>
+        <w:t xml:space="preserve"> that </w:t>
+      </w:r>
+      <w:r>
+        <w:rPr>
+          <w:rFonts w:ascii="Arial" w:hAnsi="Arial" w:cs="Arial"/>
+          <w:iCs/>
+          <w:color w:val="000000" w:themeColor="text1"/>
+        </w:rPr>
+        <w:t>team</w:t>
+      </w:r>
+      <w:r>
+        <w:rPr>
+          <w:rFonts w:ascii="Arial" w:hAnsi="Arial" w:cs="Arial"/>
+          <w:iCs/>
+          <w:color w:val="000000" w:themeColor="text1"/>
+        </w:rPr>
+        <w:t xml:space="preserve"> needed a leader to help keep them on track. You also do an excellent job of providing timely feedback and recognition to </w:t>
+      </w:r>
+      <w:r>
+        <w:rPr>
+          <w:rFonts w:ascii="Arial" w:hAnsi="Arial" w:cs="Arial"/>
+          <w:iCs/>
+          <w:color w:val="000000" w:themeColor="text1"/>
+        </w:rPr>
+        <w:t>team</w:t>
+      </w:r>
+      <w:r>
+        <w:rPr>
+          <w:rFonts w:ascii="Arial" w:hAnsi="Arial" w:cs="Arial"/>
+          <w:iCs/>
+          <w:color w:val="000000" w:themeColor="text1"/>
+        </w:rPr>
+        <w:t xml:space="preserve"> members, so they feel honored and recognized as members of your </w:t>
+      </w:r>
+      <w:r>
+        <w:rPr>
+          <w:rFonts w:ascii="Arial" w:hAnsi="Arial" w:cs="Arial"/>
+          <w:iCs/>
+          <w:color w:val="000000" w:themeColor="text1"/>
+        </w:rPr>
+        <w:t>team</w:t>
+      </w:r>
+      <w:r>
+        <w:rPr>
+          <w:rFonts w:ascii="Arial" w:hAnsi="Arial" w:cs="Arial"/>
+          <w:iCs/>
+          <w:color w:val="000000" w:themeColor="text1"/>
+        </w:rPr>
+        <w:t>.</w:t>
+      </w:r>
+      <w:bookmarkEnd w:id="0"/>
+      <w:r>
+        <w:rPr>
+          <w:rFonts w:ascii="Arial" w:hAnsi="Arial" w:cs="Arial"/>
+          <w:iCs/>
+          <w:color w:val="000000" w:themeColor="text1"/>
+        </w:rPr>
+        <w:t xml:space="preserve"> </w:t>
+      </w:r>
+    </w:p>
+    <w:p>
+      <w:pPr>
+        <w:rPr>
+          <w:rFonts w:ascii="Arial" w:hAnsi="Arial" w:cs="Arial"/>
+          <w:iCs/>
+          <w:color w:val="000000" w:themeColor="text1"/>
+        </w:rPr>
+      </w:pPr>
+    </w:p>
+    <w:p>
+      <w:pPr>
+        <w:rPr>
+          <w:rFonts w:ascii="Arial" w:hAnsi="Arial" w:cs="Arial"/>
+          <w:iCs/>
+          <w:color w:val="000000" w:themeColor="text1"/>
+        </w:rPr>
+      </w:pPr>
+      <w:r>
+        <w:rPr>
+          <w:rFonts w:ascii="Arial" w:hAnsi="Arial" w:cs="Arial"/>
+          <w:iCs/>
+          <w:color w:val="000000" w:themeColor="text1"/>
+        </w:rPr>
+        <w:t xml:space="preserve">People on your </w:t>
+      </w:r>
+      <w:r>
+        <w:rPr>
+          <w:rFonts w:ascii="Arial" w:hAnsi="Arial" w:cs="Arial"/>
+          <w:iCs/>
+          <w:color w:val="000000" w:themeColor="text1"/>
+        </w:rPr>
+        <w:t>team</w:t>
+      </w:r>
+      <w:r>
+        <w:rPr>
+          <w:rFonts w:ascii="Arial" w:hAnsi="Arial" w:cs="Arial"/>
+          <w:iCs/>
+          <w:color w:val="000000" w:themeColor="text1"/>
+        </w:rPr>
+        <w:t xml:space="preserve"> feel important and appreciated. As a result, they work hard, have high morale, treat each other with respect, and accomplish amazing things. I wish that I had more </w:t>
+      </w:r>
+      <w:r>
+        <w:rPr>
+          <w:rFonts w:ascii="Arial" w:hAnsi="Arial" w:cs="Arial"/>
+          <w:iCs/>
+          <w:color w:val="000000" w:themeColor="text1"/>
+        </w:rPr>
+        <w:t>team</w:t>
+      </w:r>
+      <w:r>
+        <w:rPr>
+          <w:rFonts w:ascii="Arial" w:hAnsi="Arial" w:cs="Arial"/>
+          <w:iCs/>
+          <w:color w:val="000000" w:themeColor="text1"/>
+        </w:rPr>
+        <w:t xml:space="preserve"> leaders who were as effective as you at </w:t>
+      </w:r>
+      <w:r>
+        <w:rPr>
+          <w:rFonts w:ascii="Arial" w:hAnsi="Arial" w:cs="Arial"/>
+          <w:iCs/>
+          <w:color w:val="000000" w:themeColor="text1"/>
+        </w:rPr>
+        <w:t>team</w:t>
+      </w:r>
+      <w:r>
+        <w:rPr>
+          <w:rFonts w:ascii="Arial" w:hAnsi="Arial" w:cs="Arial"/>
+          <w:iCs/>
+          <w:color w:val="000000" w:themeColor="text1"/>
+        </w:rPr>
+        <w:t xml:space="preserve"> leadership.</w:t>
+      </w:r>
+      <w:r>
+        <w:rPr>
+          <w:rFonts w:ascii="Arial" w:hAnsi="Arial" w:cs="Arial"/>
+          <w:iCs/>
+          <w:color w:val="000000" w:themeColor="text1"/>
+        </w:rPr>
+        <w:t xml:space="preserve"> </w:t>
+      </w:r>
+    </w:p>
+    <w:p>
+      <w:pPr>
+        <w:rPr>
+          <w:rFonts w:ascii="Arial" w:hAnsi="Arial" w:cs="Arial"/>
+          <w:iCs/>
+          <w:color w:val="000000" w:themeColor="text1"/>
+        </w:rPr>
+      </w:pPr>
+    </w:p>
+    <w:p>
+      <w:pPr>
+        <w:rPr>
+          <w:rFonts w:ascii="Arial" w:hAnsi="Arial" w:cs="Arial"/>
+          <w:iCs/>
+          <w:color w:val="000000" w:themeColor="text1"/>
+        </w:rPr>
+      </w:pPr>
+      <w:r>
+        <w:rPr>
+          <w:rFonts w:ascii="Arial" w:hAnsi="Arial" w:cs="Arial"/>
+          <w:iCs/>
+          <w:color w:val="000000" w:themeColor="text1"/>
+        </w:rPr>
+        <w:t xml:space="preserve">In recognition of your </w:t>
+      </w:r>
+      <w:r>
+        <w:rPr>
+          <w:rFonts w:ascii="Arial" w:hAnsi="Arial" w:cs="Arial"/>
+          <w:iCs/>
+          <w:color w:val="000000" w:themeColor="text1"/>
+        </w:rPr>
+        <w:t>team</w:t>
+      </w:r>
+      <w:r>
+        <w:rPr>
+          <w:rFonts w:ascii="Arial" w:hAnsi="Arial" w:cs="Arial"/>
+          <w:iCs/>
+          <w:color w:val="000000" w:themeColor="text1"/>
+        </w:rPr>
+        <w:t xml:space="preserve">'s contribution and success, let me know when you would like to take </w:t>
+      </w:r>
+      <w:r>
+        <w:rPr>
+          <w:rFonts w:ascii="Arial" w:hAnsi="Arial" w:cs="Arial"/>
+          <w:iCs/>
+          <w:color w:val="000000" w:themeColor="text1"/>
+        </w:rPr>
+        <w:t>a half day</w:t>
+      </w:r>
+      <w:r>
+        <w:rPr>
+          <w:rFonts w:ascii="Arial" w:hAnsi="Arial" w:cs="Arial"/>
+          <w:iCs/>
+          <w:color w:val="000000" w:themeColor="text1"/>
+        </w:rPr>
+        <w:t xml:space="preserve"> to participate together in a </w:t>
+      </w:r>
+      <w:r>
+        <w:rPr>
+          <w:rFonts w:ascii="Arial" w:hAnsi="Arial" w:cs="Arial"/>
+          <w:iCs/>
+          <w:color w:val="000000" w:themeColor="text1"/>
+        </w:rPr>
+        <w:t>team</w:t>
+      </w:r>
+      <w:r>
+        <w:rPr>
+          <w:rFonts w:ascii="Arial" w:hAnsi="Arial" w:cs="Arial"/>
+          <w:iCs/>
+          <w:color w:val="000000" w:themeColor="text1"/>
+        </w:rPr>
+        <w:t xml:space="preserve"> building/recognition event of your choice.</w:t>
+      </w:r>
+      <w:r>
+        <w:rPr>
+          <w:rFonts w:ascii="Arial" w:hAnsi="Arial" w:cs="Arial"/>
+          <w:iCs/>
+          <w:color w:val="000000" w:themeColor="text1"/>
+        </w:rPr>
+        <w:t xml:space="preserve"> </w:t>
+      </w:r>
+      <w:r>
+        <w:rPr>
+          <w:rFonts w:ascii="Arial" w:hAnsi="Arial" w:cs="Arial"/>
+          <w:b/>
+          <w:bCs/>
+          <w:iCs/>
+          <w:color w:val="000000" w:themeColor="text1"/>
+        </w:rPr>
+        <w:t>I</w:t>
+      </w:r>
+      <w:r>
+        <w:rPr>
+          <w:rFonts w:ascii="Arial" w:hAnsi="Arial" w:cs="Arial"/>
+          <w:iCs/>
+          <w:color w:val="000000" w:themeColor="text1"/>
+        </w:rPr>
+        <w:t xml:space="preserve"> want you to know that the senior </w:t>
+      </w:r>
+      <w:r>
+        <w:rPr>
+          <w:rFonts w:ascii="Arial" w:hAnsi="Arial" w:cs="Arial"/>
+          <w:iCs/>
+          <w:color w:val="000000" w:themeColor="text1"/>
+        </w:rPr>
+        <w:t>team</w:t>
+      </w:r>
+      <w:r>
+        <w:rPr>
+          <w:rFonts w:ascii="Arial" w:hAnsi="Arial" w:cs="Arial"/>
+          <w:iCs/>
+          <w:color w:val="000000" w:themeColor="text1"/>
+        </w:rPr>
+        <w:t xml:space="preserve"> really appreciates your efforts</w:t>
+      </w:r>
+      <w:r>
+        <w:rPr>
+          <w:rFonts w:ascii="Arial" w:hAnsi="Arial" w:cs="Arial"/>
+          <w:iCs/>
+          <w:color w:val="000000" w:themeColor="text1"/>
+        </w:rPr>
+        <w:t>, well done!</w:t>
+      </w:r>
+    </w:p>
+    <w:p>
+      <w:pPr>
+        <w:rPr>
+          <w:rFonts w:ascii="Arial" w:hAnsi="Arial" w:cs="Arial"/>
+          <w:iCs/>
+          <w:color w:val="000000" w:themeColor="text1"/>
+        </w:rPr>
+      </w:pPr>
+    </w:p>
+    <w:p>
+      <w:pPr>
+        <w:rPr>
+          <w:rFonts w:ascii="Arial" w:hAnsi="Arial" w:cs="Arial"/>
+          <w:iCs/>
+          <w:color w:val="000000" w:themeColor="text1"/>
+        </w:rPr>
+      </w:pPr>
+      <w:r>
+        <w:rPr>
+          <w:rFonts w:ascii="Arial" w:hAnsi="Arial" w:cs="Arial"/>
+          <w:iCs/>
+          <w:color w:val="000000" w:themeColor="text1"/>
+        </w:rPr>
+        <w:t xml:space="preserve">Could you confirm that the following are all available for the </w:t>
+      </w:r>
+      <w:r>
+        <w:rPr>
+          <w:rFonts w:ascii="Arial" w:hAnsi="Arial" w:cs="Arial"/>
+          <w:iCs/>
+          <w:color w:val="000000" w:themeColor="text1"/>
+        </w:rPr>
+        <w:t>team</w:t>
+      </w:r>
+      <w:r>
+        <w:rPr>
+          <w:rFonts w:ascii="Arial" w:hAnsi="Arial" w:cs="Arial"/>
+          <w:iCs/>
+          <w:color w:val="000000" w:themeColor="text1"/>
+        </w:rPr>
+        <w:t xml:space="preserve"> event? </w:t>
+      </w:r>
+    </w:p>
+    <w:p>
+      <w:pPr>
+        <w:rPr>
+          <w:rFonts w:ascii="Arial" w:hAnsi="Arial" w:cs="Arial"/>
+          <w:iCs/>
+          <w:color w:val="000000" w:themeColor="text1"/>
+        </w:rPr>
+      </w:pPr>
+    </w:p>
+    <w:p>
+      <w:pPr>
+        <w:rPr>
+          <w:rFonts w:ascii="Arial" w:hAnsi="Arial" w:cs="Arial"/>
+          <w:iCs/>
+          <w:color w:val="000000" w:themeColor="text1"/>
+        </w:rPr>
+      </w:pPr>
+    </w:p>
+    <w:p>
+      <w:pPr>
+        <w:rPr>
+          <w:rFonts w:ascii="Arial" w:hAnsi="Arial" w:cs="Arial"/>
+        </w:rPr>
+      </w:pPr>
+      <w:r>
+        <w:rPr>
+          <w:rFonts w:ascii="Arial" w:hAnsi="Arial" w:cs="Arial"/>
+        </w:rPr>
+        <w:t>Mike</w:t>
+      </w:r>
+    </w:p>
+    <w:p>
+      <w:pPr>
+        <w:rPr>
+          <w:rFonts w:ascii="Arial" w:hAnsi="Arial" w:cs="Arial"/>
+        </w:rPr>
+      </w:pPr>
+      <w:r>
+        <w:rPr>
+          <w:rFonts w:ascii="Arial" w:hAnsi="Arial" w:cs="Arial"/>
+        </w:rPr>
+        <w:t>Steve</w:t>
+      </w:r>
+    </w:p>
+    <w:p>
+      <w:pPr>
+        <w:rPr>
+          <w:rFonts w:ascii="Arial" w:hAnsi="Arial" w:cs="Arial"/>
+        </w:rPr>
+      </w:pPr>
+      <w:r>
+        <w:rPr>
+          <w:rFonts w:ascii="Arial" w:hAnsi="Arial" w:cs="Arial"/>
+        </w:rPr>
+        <w:t>Alan</w:t>
+      </w:r>
+    </w:p>
+    <w:p>
+      <w:pPr>
+        <w:rPr>
+          <w:rFonts w:ascii="Arial" w:hAnsi="Arial" w:cs="Arial"/>
+        </w:rPr>
+      </w:pPr>
+      <w:r>
+        <w:rPr>
+          <w:rFonts w:ascii="Arial" w:hAnsi="Arial" w:cs="Arial"/>
+        </w:rPr>
+        <w:t xml:space="preserve">Mary </w:t>
+      </w:r>
+    </w:p>
+    <w:p>
+      <w:pPr>
+        <w:rPr>
+          <w:rFonts w:ascii="Arial" w:hAnsi="Arial" w:cs="Arial"/>
+        </w:rPr>
+      </w:pPr>
+      <w:r>
+        <w:rPr>
+          <w:rFonts w:ascii="Arial" w:hAnsi="Arial" w:cs="Arial"/>
+        </w:rPr>
+        <w:t>Julie</w:t>
+      </w:r>
+    </w:p>
+    <w:p>
+      <w:pPr>
+        <w:rPr>
+          <w:rFonts w:ascii="Arial" w:hAnsi="Arial" w:cs="Arial"/>
+        </w:rPr>
+      </w:pPr>
+      <w:r>
+        <w:rPr>
+          <w:rFonts w:ascii="Arial" w:hAnsi="Arial" w:cs="Arial"/>
+        </w:rPr>
+        <w:t>Lynne</w:t>
+      </w:r>
+    </w:p>
+    <w:p>
+      <w:pPr>
+        <w:rPr>
+          <w:rFonts w:ascii="Arial" w:hAnsi="Arial" w:cs="Arial"/>
+        </w:rPr>
+      </w:pPr>
+      <w:r>
+        <w:rPr>
+          <w:rFonts w:ascii="Arial" w:hAnsi="Arial" w:cs="Arial"/>
+        </w:rPr>
+        <w:t>Claire</w:t>
+      </w:r>
+    </w:p>
+    <w:p>
+      <w:pPr>
+        <w:rPr>
+          <w:rFonts w:ascii="Arial" w:hAnsi="Arial" w:cs="Arial"/>
+        </w:rPr>
+      </w:pPr>
+      <w:r>
+        <w:rPr>
+          <w:rFonts w:ascii="Arial" w:hAnsi="Arial" w:cs="Arial"/>
+        </w:rPr>
+        <w:t>Abigail</w:t>
+      </w:r>
+    </w:p>
+    <w:p>
+      <w:pPr>
+        <w:rPr>
+          <w:rFonts w:ascii="Arial" w:hAnsi="Arial" w:cs="Arial"/>
+        </w:rPr>
+      </w:pPr>
+    </w:p>
+    <w:p>
+      <w:pPr>
+        <w:rPr>
+          <w:rFonts w:ascii="Arial" w:hAnsi="Arial" w:cs="Arial"/>
+        </w:rPr>
+      </w:pPr>
+    </w:p>
     <w:sectPr>
+      <w:footerReference w:type="default" r:id="rId6"/>
       <w:pgSz w:w="11906" w:h="16838"/>
       <w:pgMar w:top="1440" w:right="1440" w:bottom="1440" w:left="1440" w:header="708" w:footer="708" w:gutter="0"/>
       <w:cols w:space="708"/>
@@ -476,6 +670,16 @@
     </w:p>
   </w:endnote>
 </w:endnotes>
+</file>
+
+<file path=word/footer1.xml><?xml version="1.0" encoding="utf-8"?>
+<w:ftr xmlns:wpc="http://schemas.microsoft.com/office/word/2010/wordprocessingCanvas" xmlns:cx="http://schemas.microsoft.com/office/drawing/2014/chartex" xmlns:cx1="http://schemas.microsoft.com/office/drawing/2015/9/8/chartex" xmlns:cx2="http://schemas.microsoft.com/office/drawing/2015/10/21/chartex" xmlns:cx3="http://schemas.microsoft.com/office/drawing/2016/5/9/chartex" xmlns:cx4="http://schemas.microsoft.com/office/drawing/2016/5/10/chartex" xmlns:cx5="http://schemas.microsoft.com/office/drawing/2016/5/11/chartex" xmlns:cx6="http://schemas.microsoft.com/office/drawing/2016/5/12/chartex" xmlns:cx7="http://schemas.microsoft.com/office/drawing/2016/5/13/chartex" xmlns:cx8="http://schemas.microsoft.com/office/drawing/2016/5/14/chartex" xmlns:mc="http://schemas.openxmlformats.org/markup-compatibility/2006" xmlns:aink="http://schemas.microsoft.com/office/drawing/2016/ink" xmlns:am3d="http://schemas.microsoft.com/office/drawing/2017/model3d" xmlns:o="urn:schemas-microsoft-com:office:office" xmlns:r="http://schemas.openxmlformats.org/officeDocument/2006/relationships" xmlns:m="http://schemas.openxmlformats.org/officeDocument/2006/math" xmlns:v="urn:schemas-microsoft-com:vml" xmlns:wp14="http://schemas.microsoft.com/office/word/2010/wordprocessingDrawing" xmlns:wp="http://schemas.openxmlformats.org/drawingml/2006/wordprocessingDrawing" xmlns:w10="urn:schemas-microsoft-com:office:word" xmlns:w="http://schemas.openxmlformats.org/wordprocessingml/2006/main" xmlns:w14="http://schemas.microsoft.com/office/word/2010/wordml" xmlns:w15="http://schemas.microsoft.com/office/word/2012/wordml" xmlns:w16cex="http://schemas.microsoft.com/office/word/2018/wordml/cex" xmlns:w16cid="http://schemas.microsoft.com/office/word/2016/wordml/cid" xmlns:w16="http://schemas.microsoft.com/office/word/2018/wordml" xmlns:w16se="http://schemas.microsoft.com/office/word/2015/wordml/symex" xmlns:wpg="http://schemas.microsoft.com/office/word/2010/wordprocessingGroup" xmlns:wpi="http://schemas.microsoft.com/office/word/2010/wordprocessingInk" xmlns:wne="http://schemas.microsoft.com/office/word/2006/wordml" xmlns:wps="http://schemas.microsoft.com/office/word/2010/wordprocessingShape" mc:Ignorable="w14 w15 w16se w16cid w16 w16cex wp14">
+  <w:p>
+    <w:pPr>
+      <w:pStyle w:val="Footer"/>
+    </w:pPr>
+  </w:p>
+</w:ftr>
 </file>
 
 <file path=word/footnotes.xml><?xml version="1.0" encoding="utf-8"?>
@@ -895,7 +1099,7 @@
   <w:style w:type="paragraph" w:default="1" w:styleId="Normal">
     <w:name w:val="Normal"/>
     <w:qFormat/>
-    <w:rsid w:val="00C760D5"/>
+    <w:rsid w:val="00C30E76"/>
     <w:pPr>
       <w:spacing w:after="0" w:line="240" w:lineRule="auto"/>
     </w:pPr>
@@ -932,51 +1136,13 @@
     <w:semiHidden/>
     <w:unhideWhenUsed/>
   </w:style>
-  <w:style w:type="table" w:styleId="TableGrid">
-    <w:name w:val="Table Grid"/>
-    <w:basedOn w:val="TableNormal"/>
-    <w:uiPriority w:val="39"/>
-    <w:rsid w:val="00867FB4"/>
-    <w:pPr>
-      <w:spacing w:after="0" w:line="240" w:lineRule="auto"/>
-    </w:pPr>
-    <w:tblPr>
-      <w:tblBorders>
-        <w:top w:val="single" w:sz="4" w:space="0" w:color="auto"/>
-        <w:left w:val="single" w:sz="4" w:space="0" w:color="auto"/>
-        <w:bottom w:val="single" w:sz="4" w:space="0" w:color="auto"/>
-        <w:right w:val="single" w:sz="4" w:space="0" w:color="auto"/>
-        <w:insideH w:val="single" w:sz="4" w:space="0" w:color="auto"/>
-        <w:insideV w:val="single" w:sz="4" w:space="0" w:color="auto"/>
-      </w:tblBorders>
-    </w:tblPr>
-  </w:style>
-  <w:style w:type="character" w:styleId="LineNumber">
-    <w:name w:val="line number"/>
-    <w:basedOn w:val="DefaultParagraphFont"/>
-    <w:uiPriority w:val="99"/>
-    <w:semiHidden/>
-    <w:unhideWhenUsed/>
-    <w:rsid w:val="0010497D"/>
-  </w:style>
-  <w:style w:type="paragraph" w:styleId="ListParagraph">
-    <w:name w:val="List Paragraph"/>
-    <w:basedOn w:val="Normal"/>
-    <w:uiPriority w:val="34"/>
-    <w:qFormat/>
-    <w:rsid w:val="00A31FF8"/>
-    <w:pPr>
-      <w:ind w:left="720"/>
-      <w:contextualSpacing/>
-    </w:pPr>
-  </w:style>
   <w:style w:type="paragraph" w:styleId="Header">
     <w:name w:val="header"/>
     <w:basedOn w:val="Normal"/>
     <w:link w:val="HeaderChar"/>
     <w:uiPriority w:val="99"/>
     <w:unhideWhenUsed/>
-    <w:rsid w:val="00A31FF8"/>
+    <w:rsid w:val="007D62A3"/>
     <w:pPr>
       <w:tabs>
         <w:tab w:val="center" w:pos="4513"/>
@@ -989,7 +1155,7 @@
     <w:basedOn w:val="DefaultParagraphFont"/>
     <w:link w:val="Header"/>
     <w:uiPriority w:val="99"/>
-    <w:rsid w:val="00A31FF8"/>
+    <w:rsid w:val="007D62A3"/>
     <w:rPr>
       <w:sz w:val="24"/>
       <w:szCs w:val="24"/>
@@ -1002,7 +1168,7 @@
     <w:link w:val="FooterChar"/>
     <w:uiPriority w:val="99"/>
     <w:unhideWhenUsed/>
-    <w:rsid w:val="00A31FF8"/>
+    <w:rsid w:val="007D62A3"/>
     <w:pPr>
       <w:tabs>
         <w:tab w:val="center" w:pos="4513"/>
@@ -1015,7 +1181,7 @@
     <w:basedOn w:val="DefaultParagraphFont"/>
     <w:link w:val="Footer"/>
     <w:uiPriority w:val="99"/>
-    <w:rsid w:val="00A31FF8"/>
+    <w:rsid w:val="007D62A3"/>
     <w:rPr>
       <w:sz w:val="24"/>
       <w:szCs w:val="24"/>

</xml_diff>